<commit_message>
docs: v0.0.3 manual — article rule wording
</commit_message>
<xml_diff>
--- a/docs/manual/PriceRadar_Руководство_пользователя_v0.0.3.docx
+++ b/docs/manual/PriceRadar_Руководство_пользователя_v0.0.3.docx
@@ -4253,7 +4253,7 @@
         <w:spacing w:after="120"/>
       </w:pPr>
       <w:r>
-        <w:t xml:space="preserve">Перед опросом источников поиск смотрит в прайс NETLAB. Если по запросу там ровно один подходящий товар, его артикул становится артикулом поиска: СРВТрейд и Servermall ищут по нему, маркетплейсы получают точный код в запросе, а строки с этим артикулом отмечаются как «Точное» совпадение. Если подходящих товаров несколько (цвета, комплекты, версии с радиатором), артикулы только запоминаются, а поиск идёт по модели.</w:t>
+        <w:t xml:space="preserve">Перед опросом источников поиск смотрит в прайс NETLAB. Если по запросу там ровно один подходящий товар и в его артикуле есть номер модели из запроса, этот артикул становится артикулом поиска: СРВТрейд и Servermall ищут по нему, маркетплейсы получают точный код в запросе, а строки с этим артикулом отмечаются как «Точное» совпадение. Если подходящих товаров несколько (цвета, комплекты, версии с радиатором), артикулы только запоминаются, а поиск идёт по модели.</w:t>
       </w:r>
     </w:p>
     <w:tbl>
@@ -4450,7 +4450,7 @@
           </w:tcPr>
           <w:p>
             <w:r>
-              <w:t xml:space="preserve">amd ryzen 7 7800x3d</w:t>
+              <w:t xml:space="preserve">12400 процессор</w:t>
             </w:r>
           </w:p>
         </w:tc>
@@ -4473,7 +4473,7 @@
           </w:tcPr>
           <w:p>
             <w:r>
-              <w:t xml:space="preserve">100-000000910</w:t>
+              <w:t xml:space="preserve">CM8071504555317SRL4V (OEM)</w:t>
             </w:r>
           </w:p>
         </w:tc>
@@ -4496,7 +4496,7 @@
           </w:tcPr>
           <w:p>
             <w:r>
-              <w:t xml:space="preserve">Бренд указан — ищет по артикулу 100-000000910. Без слова «AMD» артикул не подставится: в нём нет номера 7800</w:t>
+              <w:t xml:space="preserve">Не подставляет: в артикуле нет номера 12400 — иначе стёрлась бы разница 12400 / 12400F. Ищет по модели</w:t>
             </w:r>
           </w:p>
         </w:tc>

</xml_diff>